<commit_message>
Remove team section from project report
</commit_message>
<xml_diff>
--- a/Mini-Trello_Project_Report.docx
+++ b/Mini-Trello_Project_Report.docx
@@ -839,169 +839,6 @@
         <w:t>{ "id": "7", "title": "Set up Express server", "description": "Create basic routes.", "status": "todo" }</w:t>
       </w:r>
     </w:p>
-    <w:p>
-      <w:pPr>
-        <w:pStyle w:val="Heading1"/>
-      </w:pPr>
-      <w:r>
-        <w:t>7. Team Responsibility Breakdown</w:t>
-      </w:r>
-    </w:p>
-    <w:tbl>
-      <w:tblPr>
-        <w:tblStyle w:val="LightGrid-Accent1"/>
-        <w:tblW w:type="auto" w:w="0"/>
-        <w:tblLook w:firstColumn="1" w:firstRow="1" w:lastColumn="0" w:lastRow="0" w:noHBand="0" w:noVBand="1" w:val="04A0"/>
-      </w:tblPr>
-      <w:tblGrid>
-        <w:gridCol w:w="2880"/>
-        <w:gridCol w:w="2880"/>
-        <w:gridCol w:w="2880"/>
-      </w:tblGrid>
-      <w:tr>
-        <w:tc>
-          <w:tcPr>
-            <w:tcW w:type="dxa" w:w="2880"/>
-          </w:tcPr>
-          <w:p>
-            <w:r>
-              <w:rPr>
-                <w:b/>
-              </w:rPr>
-              <w:t>Team Member</w:t>
-            </w:r>
-          </w:p>
-        </w:tc>
-        <w:tc>
-          <w:tcPr>
-            <w:tcW w:type="dxa" w:w="2880"/>
-          </w:tcPr>
-          <w:p>
-            <w:r>
-              <w:rPr>
-                <w:b/>
-              </w:rPr>
-              <w:t>Role</w:t>
-            </w:r>
-          </w:p>
-        </w:tc>
-        <w:tc>
-          <w:tcPr>
-            <w:tcW w:type="dxa" w:w="2880"/>
-          </w:tcPr>
-          <w:p>
-            <w:r>
-              <w:rPr>
-                <w:b/>
-              </w:rPr>
-              <w:t>Responsibility</w:t>
-            </w:r>
-          </w:p>
-        </w:tc>
-      </w:tr>
-      <w:tr>
-        <w:tc>
-          <w:tcPr>
-            <w:tcW w:type="dxa" w:w="2880"/>
-          </w:tcPr>
-          <w:p>
-            <w:r>
-              <w:t>[Member 1]</w:t>
-            </w:r>
-          </w:p>
-        </w:tc>
-        <w:tc>
-          <w:tcPr>
-            <w:tcW w:type="dxa" w:w="2880"/>
-          </w:tcPr>
-          <w:p>
-            <w:r>
-              <w:t>[Role]</w:t>
-            </w:r>
-          </w:p>
-        </w:tc>
-        <w:tc>
-          <w:tcPr>
-            <w:tcW w:type="dxa" w:w="2880"/>
-          </w:tcPr>
-          <w:p>
-            <w:r>
-              <w:t>[Database + Backend API]</w:t>
-            </w:r>
-          </w:p>
-        </w:tc>
-      </w:tr>
-      <w:tr>
-        <w:tc>
-          <w:tcPr>
-            <w:tcW w:type="dxa" w:w="2880"/>
-          </w:tcPr>
-          <w:p>
-            <w:r>
-              <w:t>[Member 2]</w:t>
-            </w:r>
-          </w:p>
-        </w:tc>
-        <w:tc>
-          <w:tcPr>
-            <w:tcW w:type="dxa" w:w="2880"/>
-          </w:tcPr>
-          <w:p>
-            <w:r>
-              <w:t>[Role]</w:t>
-            </w:r>
-          </w:p>
-        </w:tc>
-        <w:tc>
-          <w:tcPr>
-            <w:tcW w:type="dxa" w:w="2880"/>
-          </w:tcPr>
-          <w:p>
-            <w:r>
-              <w:t>[Frontend Layout + Integration]</w:t>
-            </w:r>
-          </w:p>
-        </w:tc>
-      </w:tr>
-      <w:tr>
-        <w:tc>
-          <w:tcPr>
-            <w:tcW w:type="dxa" w:w="2880"/>
-          </w:tcPr>
-          <w:p>
-            <w:r>
-              <w:t>[Member 3]</w:t>
-            </w:r>
-          </w:p>
-        </w:tc>
-        <w:tc>
-          <w:tcPr>
-            <w:tcW w:type="dxa" w:w="2880"/>
-          </w:tcPr>
-          <w:p>
-            <w:r>
-              <w:t>[Role]</w:t>
-            </w:r>
-          </w:p>
-        </w:tc>
-        <w:tc>
-          <w:tcPr>
-            <w:tcW w:type="dxa" w:w="2880"/>
-          </w:tcPr>
-          <w:p>
-            <w:r>
-              <w:t>[Testing + Documentation]</w:t>
-            </w:r>
-          </w:p>
-        </w:tc>
-      </w:tr>
-    </w:tbl>
-    <w:p/>
-    <w:p>
-      <w:r>
-        <w:t>Note: Replace all [bracketed] placeholders with actual student/team details before submission.</w:t>
-      </w:r>
-    </w:p>
     <w:sectPr>
       <w:pgSz w:w="12240" w:h="15840"/>
       <w:pgMar w:top="1440" w:right="1800" w:bottom="1440" w:left="1800" w:header="720" w:footer="720" w:gutter="0"/>

</xml_diff>

<commit_message>
Update report, README and source zip for final submission
</commit_message>
<xml_diff>
--- a/Mini-Trello_Project_Report.docx
+++ b/Mini-Trello_Project_Report.docx
@@ -162,6 +162,70 @@
     </w:p>
     <w:p>
       <w:pPr>
+        <w:pStyle w:val="ListBullet"/>
+      </w:pPr>
+      <w:r>
+        <w:t>Edit existing tasks (title, description, priority, status, due date)</w:t>
+      </w:r>
+    </w:p>
+    <w:p>
+      <w:pPr>
+        <w:pStyle w:val="ListBullet"/>
+      </w:pPr>
+      <w:r>
+        <w:t>Move cards between columns using native drag-and-drop or arrow buttons</w:t>
+      </w:r>
+    </w:p>
+    <w:p>
+      <w:pPr>
+        <w:pStyle w:val="ListBullet"/>
+      </w:pPr>
+      <w:r>
+        <w:t>Priority levels (Low / Medium / High) with color-coded badges</w:t>
+      </w:r>
+    </w:p>
+    <w:p>
+      <w:pPr>
+        <w:pStyle w:val="ListBullet"/>
+      </w:pPr>
+      <w:r>
+        <w:t>Due dates with automatic overdue highlighting</w:t>
+      </w:r>
+    </w:p>
+    <w:p>
+      <w:pPr>
+        <w:pStyle w:val="ListBullet"/>
+      </w:pPr>
+      <w:r>
+        <w:t>Live stats panel and completion progress bar</w:t>
+      </w:r>
+    </w:p>
+    <w:p>
+      <w:pPr>
+        <w:pStyle w:val="ListBullet"/>
+      </w:pPr>
+      <w:r>
+        <w:t>Instant search and status filtering</w:t>
+      </w:r>
+    </w:p>
+    <w:p>
+      <w:pPr>
+        <w:pStyle w:val="ListBullet"/>
+      </w:pPr>
+      <w:r>
+        <w:t>Dark / Light mode toggle with saved preference</w:t>
+      </w:r>
+    </w:p>
+    <w:p>
+      <w:pPr>
+        <w:pStyle w:val="ListBullet"/>
+      </w:pPr>
+      <w:r>
+        <w:t>Fully responsive layout for desktop, tablet and mobile</w:t>
+      </w:r>
+    </w:p>
+    <w:p>
+      <w:pPr>
         <w:pStyle w:val="Heading1"/>
       </w:pPr>
       <w:r>
@@ -278,7 +342,7 @@
     </w:p>
     <w:p>
       <w:r>
-        <w:t>The project was developed using the Agile/Scrum methodology and executed in two one-week sprints.</w:t>
+        <w:t>The project was developed using the Agile/Scrum methodology and executed in three short sprints, with a review and retrospective after every sprint.</w:t>
       </w:r>
     </w:p>
     <w:p>
@@ -294,7 +358,7 @@
         <w:pStyle w:val="ListNumber"/>
       </w:pPr>
       <w:r>
-        <w:t>Conducted Sprint Planning and assigned tasks to team members.</w:t>
+        <w:t>Conducted Sprint Planning and prepared the product backlog of user stories.</w:t>
       </w:r>
     </w:p>
     <w:p>
@@ -347,7 +411,7 @@
         <w:pStyle w:val="ListNumber"/>
       </w:pPr>
       <w:r>
-        <w:t>Completed Update and Delete routes (PATCH status, DELETE task).</w:t>
+        <w:t>Completed Update and Delete routes (PATCH, PUT, DELETE).</w:t>
       </w:r>
     </w:p>
     <w:p>
@@ -369,6 +433,59 @@
     <w:p>
       <w:r>
         <w:t>Deliverable at Sprint 2 Review: A fully functional Mini-Trello board where actions on the UI correctly persist in the database.</w:t>
+      </w:r>
+    </w:p>
+    <w:p>
+      <w:pPr>
+        <w:pStyle w:val="Heading2"/>
+      </w:pPr>
+      <w:r>
+        <w:t>Sprint 3 - UX Polish &amp; Enhancement</w:t>
+      </w:r>
+    </w:p>
+    <w:p>
+      <w:pPr>
+        <w:pStyle w:val="ListNumber"/>
+      </w:pPr>
+      <w:r>
+        <w:t>Conducted Sprint 2 Retrospective and Sprint 3 Planning.</w:t>
+      </w:r>
+    </w:p>
+    <w:p>
+      <w:pPr>
+        <w:pStyle w:val="ListNumber"/>
+      </w:pPr>
+      <w:r>
+        <w:t>Added drag-and-drop between columns and quick-move arrow buttons on cards.</w:t>
+      </w:r>
+    </w:p>
+    <w:p>
+      <w:pPr>
+        <w:pStyle w:val="ListNumber"/>
+      </w:pPr>
+      <w:r>
+        <w:t>Integrated priority levels, due dates, and automatic overdue highlighting.</w:t>
+      </w:r>
+    </w:p>
+    <w:p>
+      <w:pPr>
+        <w:pStyle w:val="ListNumber"/>
+      </w:pPr>
+      <w:r>
+        <w:t>Added instant search, status filtering, live stats, and a completion progress bar.</w:t>
+      </w:r>
+    </w:p>
+    <w:p>
+      <w:pPr>
+        <w:pStyle w:val="ListNumber"/>
+      </w:pPr>
+      <w:r>
+        <w:t>Implemented dark / light mode and a fully responsive mobile layout.</w:t>
+      </w:r>
+    </w:p>
+    <w:p>
+      <w:r>
+        <w:t>Deliverable at Sprint 3 Review: A polished, feature-rich board deployed live on Render with search, filters, priorities, due dates, and dark mode.</w:t>
       </w:r>
     </w:p>
     <w:p>
@@ -409,6 +526,38 @@
       </w:pPr>
       <w:r>
         <w:t>[MEDIUM] As a user, I want to delete a task if it was created by mistake.</w:t>
+      </w:r>
+    </w:p>
+    <w:p>
+      <w:pPr>
+        <w:pStyle w:val="ListBullet"/>
+      </w:pPr>
+      <w:r>
+        <w:t>[HIGH] As a user, I want to edit a task so that I can update its title, description, priority, or due date.</w:t>
+      </w:r>
+    </w:p>
+    <w:p>
+      <w:pPr>
+        <w:pStyle w:val="ListBullet"/>
+      </w:pPr>
+      <w:r>
+        <w:t>[MEDIUM] As a user, I want to move tasks by dragging and dropping them between columns.</w:t>
+      </w:r>
+    </w:p>
+    <w:p>
+      <w:pPr>
+        <w:pStyle w:val="ListBullet"/>
+      </w:pPr>
+      <w:r>
+        <w:t>[MEDIUM] As a user, I want to search and filter my tasks so that I can find them quickly.</w:t>
+      </w:r>
+    </w:p>
+    <w:p>
+      <w:pPr>
+        <w:pStyle w:val="ListBullet"/>
+      </w:pPr>
+      <w:r>
+        <w:t>[LOW] As a user, I want a dark mode and a mobile-friendly layout for comfortable use.</w:t>
       </w:r>
     </w:p>
     <w:p>
@@ -786,13 +935,17 @@
         </w:rPr>
         <w:t>{</w:t>
         <w:br/>
-        <w:t xml:space="preserve">  "id": "101",</w:t>
+        <w:t xml:space="preserve">  "id": "66b8f2b12c4a7a1f8d3e9c5a",</w:t>
         <w:br/>
-        <w:t xml:space="preserve">  "title": "Design Database Schema",</w:t>
+        <w:t xml:space="preserve">  "title": "Prepare Project Report",</w:t>
         <w:br/>
-        <w:t xml:space="preserve">  "description": "Create ER diagram for the task and user tables.",</w:t>
+        <w:t xml:space="preserve">  "description": "Compile screenshots, API table and agile summary.",</w:t>
         <w:br/>
-        <w:t xml:space="preserve">  "status": "in_progress"</w:t>
+        <w:t xml:space="preserve">  "status": "in_progress",</w:t>
+        <w:br/>
+        <w:t xml:space="preserve">  "priority": "high",</w:t>
+        <w:br/>
+        <w:t xml:space="preserve">  "due_date": "2026-09-20"</w:t>
         <w:br/>
         <w:t>}</w:t>
       </w:r>
@@ -819,7 +972,7 @@
           <w:rFonts w:ascii="Consolas" w:hAnsi="Consolas"/>
           <w:sz w:val="20"/>
         </w:rPr>
-        <w:t>{ "title": "Set up Express server", "description": "Create basic routes." }</w:t>
+        <w:t>{ "title": "Design landing page UI", "description": "Create the homepage mockup in Figma.", "priority": "high", "due_date": "2026-09-15" }</w:t>
       </w:r>
     </w:p>
     <w:p>
@@ -836,9 +989,121 @@
           <w:rFonts w:ascii="Consolas" w:hAnsi="Consolas"/>
           <w:sz w:val="20"/>
         </w:rPr>
-        <w:t>{ "id": "7", "title": "Set up Express server", "description": "Create basic routes.", "status": "todo" }</w:t>
+        <w:t>{ "id": "66b8f2b12c4a7a1f8d3e9c5b", "title": "Design landing page UI", "description": "Create the homepage mockup in Figma.", "status": "todo", "priority": "high", "due_date": "2026-09-15" }</w:t>
       </w:r>
     </w:p>
+    <w:p>
+      <w:pPr>
+        <w:pStyle w:val="Heading1"/>
+      </w:pPr>
+      <w:r>
+        <w:t>7. Team Responsibility Breakdown</w:t>
+      </w:r>
+    </w:p>
+    <w:p>
+      <w:r>
+        <w:t>This mini project was developed as an individual project. The responsibilities below were handled by the single team member across planning, development, and delivery:</w:t>
+      </w:r>
+    </w:p>
+    <w:tbl>
+      <w:tblPr>
+        <w:tblStyle w:val="LightGrid-Accent1"/>
+        <w:tblW w:type="auto" w:w="0"/>
+        <w:jc w:val="center"/>
+        <w:tblLook w:firstColumn="1" w:firstRow="1" w:lastColumn="0" w:lastRow="0" w:noHBand="0" w:noVBand="1" w:val="04A0"/>
+      </w:tblPr>
+      <w:tblGrid>
+        <w:gridCol w:w="2600"/>
+        <w:gridCol w:w="2200"/>
+        <w:gridCol w:w="4600"/>
+      </w:tblGrid>
+      <w:tr>
+        <w:tc>
+          <w:tcPr>
+            <w:tcW w:type="dxa" w:w="2600"/>
+          </w:tcPr>
+          <w:p>
+            <w:r>
+              <w:rPr>
+                <w:b/>
+                <w:sz w:val="20"/>
+              </w:rPr>
+              <w:t>Team Member</w:t>
+            </w:r>
+          </w:p>
+        </w:tc>
+        <w:tc>
+          <w:tcPr>
+            <w:tcW w:type="dxa" w:w="2200"/>
+          </w:tcPr>
+          <w:p>
+            <w:r>
+              <w:rPr>
+                <w:b/>
+                <w:sz w:val="20"/>
+              </w:rPr>
+              <w:t>Role</w:t>
+            </w:r>
+          </w:p>
+        </w:tc>
+        <w:tc>
+          <w:tcPr>
+            <w:tcW w:type="dxa" w:w="4600"/>
+          </w:tcPr>
+          <w:p>
+            <w:r>
+              <w:rPr>
+                <w:b/>
+                <w:sz w:val="20"/>
+              </w:rPr>
+              <w:t>Responsibility</w:t>
+            </w:r>
+          </w:p>
+        </w:tc>
+      </w:tr>
+      <w:tr>
+        <w:tc>
+          <w:tcPr>
+            <w:tcW w:type="dxa" w:w="2600"/>
+          </w:tcPr>
+          <w:p>
+            <w:r>
+              <w:rPr>
+                <w:sz w:val="20"/>
+              </w:rPr>
+              <w:t>Kirankumar Thakor</w:t>
+            </w:r>
+          </w:p>
+        </w:tc>
+        <w:tc>
+          <w:tcPr>
+            <w:tcW w:type="dxa" w:w="2200"/>
+          </w:tcPr>
+          <w:p>
+            <w:r>
+              <w:rPr>
+                <w:sz w:val="20"/>
+              </w:rPr>
+              <w:t>Full-Stack Developer</w:t>
+            </w:r>
+          </w:p>
+        </w:tc>
+        <w:tc>
+          <w:tcPr>
+            <w:tcW w:type="dxa" w:w="4600"/>
+          </w:tcPr>
+          <w:p>
+            <w:r>
+              <w:rPr>
+                <w:sz w:val="20"/>
+              </w:rPr>
+              <w:t>Database design, Backend REST API, Frontend UI, Integration, Testing, Documentation &amp; Deployment</w:t>
+            </w:r>
+          </w:p>
+        </w:tc>
+      </w:tr>
+    </w:tbl>
+    <w:p/>
     <w:sectPr>
       <w:pgSz w:w="12240" w:h="15840"/>
       <w:pgMar w:top="1440" w:right="1800" w:bottom="1440" w:left="1800" w:header="720" w:footer="720" w:gutter="0"/>

</xml_diff>